<commit_message>
v14 rebuilt after the independent review: rescaled calibrated nulls, row blocks on common records, scoped claims, Table XV rows; all checks pass
</commit_message>
<xml_diff>
--- a/paper/SHAP_VPN_revised_v14.docx
+++ b/paper/SHAP_VPN_revised_v14.docx
@@ -258,7 +258,7 @@
       </w:r>
       <w:r>
         <w:rPr/>
-        <w:t xml:space="preserve">Global SHAP rankings are commonly interpreted as a guide to encrypted traffic, but a ranking learned in one observation context may not apply elsewhere. We evaluate this on the seven-class application task of the ISCX VPN-nonVPN benchmark, using TreeSHAP to explain Random Forest and XGBoost models trained separately on Non-VPN and VPN flows. Each model keeps only three of its five leading features when the observation context changes. Compared with models trained on random halves of one context, cross-context Spearman agreement is lower by 0.13 (XGBoost) and 0.19 (Random Forest), which a permutation null preserving both class mixes does not replicate. Keeping related flows in the same half reduces the gap by an amount that depends on the proxy for capture sessions: to about zero on average with clusters of similar flows roughly the size of the capture files, where the half-models are weak and opposite gaps in the two contexts cancel, but only to 0.07 and 0.15 with blocks of consecutive flows in the original files, and to 0.03 and 0.09 with first- and second-half splits. A model trained in one context achieves at best 0.43–0.61 macro F1 in the other, while a SHAP-chosen Top-10 feature list loses little macro F1 when transferred, in a test of limited power. Part of the random-split gap reflects related flows; the rest survives explanation on common records and exceeds a grouped permutation null under row-block grouping, but the contexts are different capture sets, so none of it can be attributed to tunnelling.</w:t>
+        <w:t xml:space="preserve">Global SHAP rankings are commonly interpreted as a guide to encrypted traffic, but a ranking learned in one observation context may not apply elsewhere. We evaluate this on the seven-class application task of the ISCX VPN-nonVPN benchmark, using TreeSHAP to explain Random Forest and XGBoost models trained separately on Non-VPN and VPN flows. Each model keeps only three of its five leading features when the observation context changes. Compared with models trained on random halves of one context, cross-context Spearman agreement is lower by 0.13 (XGBoost) and 0.19 (Random Forest), which a permutation null preserving both class mixes does not replicate. Keeping related flows in the same half reduces the gap by an amount that depends on the proxy for capture sessions: to about zero on average with clusters of similar flows roughly the size of the capture files, where the half-models are weak and opposite gaps in the two contexts cancel, but only to 0.07 and 0.15 with blocks of consecutive flows in the original files, and to 0.03 and 0.09 with first- and second-half splits. A model trained in one context reaches only 0.43–0.61 macro F1 in the other, while a SHAP-chosen Top-10 feature list loses little macro F1 when transferred, in a test of limited power. Part of the random-split gap reflects related flows; under row-block grouping a smaller gap remains on common explained records and above a grouped permutation null, but the contexts are different capture sets, so none of it can be attributed to tunnelling.</w:t>
       </w:r>
     </w:p>
     <w:p>
@@ -406,7 +406,7 @@
       </w:pPr>
       <w:r>
         <w:rPr/>
-        <w:t xml:space="preserve">As encryption spread, traffic classification moved from port and payload analysis to statistical and learning-based methods, as several surveys report [1–3]. Encrypted flows still carry usable information: inter-arrival times, packet sizes, byte and packet rates and flow duration all survive encryption and can serve as features. Classical learners on such features perform well on many tasks [3, 4], and deep models that take packet sequences or raw bytes as input [5–8, 21] have done better in some settings. Comparing these methods is difficult because studies prepare, split and label their data differently [22, 23]. VPN traffic adds another layer. Draper-Gil et al. [4] captured traffic from several application categories inside and outside a VPN and showed that time-related features can both detect VPN traffic and identify the application inside the tunnel; the companion paper [24] used similar features to recognise Tor traffic. The same dataset was later used to evaluate deep learning models that classify packets and bytes [5, 7]. In these studies a method is usually judged by its accuracy or F1 on a single train/test partition.</w:t>
+        <w:t xml:space="preserve">As encryption spread, traffic classification moved from port and payload analysis to statistical and learning-based methods, as several surveys report [1–3]. Encryption does not remove all information about a flow: inter-arrival times, packet sizes, byte and packet rates and flow duration remain observable and can serve as features. Classical learners on such features perform well on many tasks [3, 4], and deep models that take packet sequences or raw bytes as input [5–8, 21] have done better in some settings. Comparing these methods is difficult because studies prepare, split and label their data differently [22, 23]. VPN traffic adds another layer. Draper-Gil et al. [4] captured traffic from several application categories inside and outside a VPN and showed that time-related features can both detect VPN traffic and identify the application inside the tunnel; the companion paper [24] used similar features to recognise Tor traffic. The same dataset was later used to evaluate deep learning models that take packet- or byte-level input [5, 7]. In these studies a method is usually judged by its accuracy or F1 on a single train/test partition.</w:t>
       </w:r>
     </w:p>
     <w:p>
@@ -7575,7 +7575,7 @@
       </w:r>
       <w:r>
         <w:rPr/>
-        <w:t xml:space="preserve">For five grouped designs (clusters of about 10 and 35 flows, calibrated clusters, calibrated row blocks and the first-versus-second-half split) we build the null in two ways, because neither is neutral on its own. In the flow-level version, flows are reassigned one by one as above and the grouped design is then applied within each pseudo-context. Flows of one capture then sit in both pseudo-contexts, so the pseudo cross pairs share related flows that the grouped within pairs do not, which pushes </w:t>
+        <w:t xml:space="preserve">For five grouped designs (clusters of about 10 and 35 flows, calibrated clusters, calibrated row blocks and the first-versus-second-half split) we build the null in two ways, because neither is neutral on its own. In the flow-level version, flows are reassigned one by one as above and the grouped design is then applied within each pseudo-context. Flows of one capture then sit in both pseudo-contexts, so the pseudo cross pairs share more related flows than the grouped within pairs do, which pushes </w:t>
       </w:r>
       <ns0:oMath xmlns:ns0="http://schemas.openxmlformats.org/officeDocument/2006/math">
         <ns0:r>
@@ -7587,7 +7587,7 @@
       </ns0:oMath>
       <w:r>
         <w:rPr/>
-        <w:t xml:space="preserve"> down. In the group-level version, whole capture-sized groups move instead: within each class and source file, the pooled flows are divided into the calibrated clusters (for the cluster designs) or the calibrated row blocks (for the row-block designs), and each group is assigned at random to one pseudo-context so that each receives about its original share of the class; because whole groups move, class counts are matched only approximately. Calibrated clusters are regions of feature space, so for the cluster designs this version also gives the two pseudo-contexts different feature distributions, which pushes </w:t>
+        <w:t xml:space="preserve"> down. In the group-level version, whole capture-sized groups move instead: within each class and source file, the pooled flows are divided into the calibrated clusters (for the cluster designs) or the calibrated row blocks (for the row-block designs), and the groups are taken in random order, each going to the pseudo-context that is further below its original share of the class. Because whole groups move, class counts are matched only approximately, and the halves hold 2,409–3,589 training flows, against 3,457–3,476 in the real grouped designs. Calibrated clusters are regions of feature space, so for the cluster designs this version also gives the two pseudo-contexts different feature distributions, which pushes </w:t>
       </w:r>
       <ns0:oMath xmlns:ns0="http://schemas.openxmlformats.org/officeDocument/2006/math">
         <ns0:r>
@@ -7599,7 +7599,7 @@
       </ns0:oMath>
       <w:r>
         <w:rPr/>
-        <w:t xml:space="preserve"> up; row blocks are not built from the features. In both versions the grouped design runs separately on the flows of each source file, so that both halves hold the same mix of Non-VPN and VPN rows.</w:t>
+        <w:t xml:space="preserve"> up; row blocks are not built from the features, although row position is correlated with some of them. In both versions the grouped design runs separately on the flows of each source file, so that both halves hold the same mix of Non-VPN and VPN rows, and in the calibrated designs the number of groups is scaled to the share of the file's flows that a pseudo-context holds, so that groups stay about capture-sized. An earlier version without the per-file split was discarded because its two halves could hold very different shares of Non-VPN and VPN rows.</w:t>
       </w:r>
     </w:p>
     <w:p>
@@ -12869,7 +12869,7 @@
       </ns0:oMath>
       <w:r>
         <w:rPr/>
-        <w:t xml:space="preserve"> of -0.001 for XGBoost (range -0.019 to 0.009) and +0.028 for Random Forest (range -0.010 to 0.052). Nor does the gap come from explaining the two contexts on different records. When every half-model is explained on the same records, </w:t>
+        <w:t xml:space="preserve"> of -0.001 for XGBoost (range -0.019 to 0.009) and +0.028 for Random Forest (range -0.010 to 0.052). Nor does the gap come mainly from explaining the two contexts on different records. When every half-model is explained on the same records, </w:t>
       </w:r>
       <ns0:oMath xmlns:ns0="http://schemas.openxmlformats.org/officeDocument/2006/math">
         <ns0:r>
@@ -12881,7 +12881,7 @@
       </ns0:oMath>
       <w:r>
         <w:rPr/>
-        <w:t xml:space="preserve"> is 0.123–0.130 for XGBoost and 0.134–0.147 for Random Forest across the three common record sets (the Non-VPN records, the VPN records and both together), against 0.129 and 0.186 when each model is explained on its own context's records, and it is positive in all 11 repeats for both models. For XGBoost the explained records make no material difference. For Random Forest they account for about 21–28% of the gap, and the RBO gap falls from 0.302 to 0.161–0.189. The primary models agree: on common records their cross-context </w:t>
+        <w:t xml:space="preserve"> is 0.123–0.130 for XGBoost and 0.134–0.147 for Random Forest across the three common record sets (the Non-VPN records, the VPN records and both together), against 0.129 and 0.186 when each model is explained on its own context's records, and it is positive in all 11 repeats for both models. For XGBoost the explained records make little difference to </w:t>
       </w:r>
       <ns0:oMath xmlns:ns0="http://schemas.openxmlformats.org/officeDocument/2006/math">
         <ns0:r>
@@ -12893,6 +12893,18 @@
       </ns0:oMath>
       <w:r>
         <w:rPr/>
+        <w:t xml:space="preserve">, although the RBO gap falls from 0.152 to 0.121–0.149. For Random Forest they account for about 21–28% of the gap, and the RBO gap falls from 0.302 to 0.161–0.189. The primary models agree: on common records their cross-context </w:t>
+      </w:r>
+      <ns0:oMath xmlns:ns0="http://schemas.openxmlformats.org/officeDocument/2006/math">
+        <ns0:r>
+          <w:rPr>
+            <w:rFonts w:ascii="Cambria Math" w:hAnsi="Cambria Math"/>
+          </w:rPr>
+          <ns0:t>ρ</ns0:t>
+        </ns0:r>
+      </ns0:oMath>
+      <w:r>
+        <w:rPr/>
         <w:t xml:space="preserve"> is 0.863–0.883 for Random Forest and 0.771–0.787 for XGBoost, against 0.830 and 0.786 on their own test partitions.</w:t>
       </w:r>
     </w:p>
@@ -13005,7 +13017,43 @@
       </ns0:oMath>
       <w:r>
         <w:rPr/>
-        <w:t xml:space="preserve"> close to zero (-0.022 to 0.032), so this grouping produces almost no gap of its own, and the real row-block gaps lie above it: against the group-level null by 0.063 and 0.035 for XGBoost and by 0.121 and 0.111 for Random Forest at the calibrated and first-versus-second-half settings, with 5–11 of the 11 real repeats above the largest null repeat. For clusters, the two versions point in the directions expected from their construction: the flow-level null gives -0.064 to -0.009 and the group-level null 0.041 to 0.265, with a spread across repeats of up to 0.184, and the real cluster gaps (0.014 to 0.100) lie between them. No neutral null could be built for feature clusters, so the cluster results do not show whether an excess remains once related flows are kept together.</w:t>
+        <w:t xml:space="preserve"> close to zero (-0.022 to 0.023) at the two settings tested, so this grouping produces almost no gap of its own, and the real row-block gaps lie above it: against the group-level null by 0.069 and 0.035 for XGBoost and by 0.130 and 0.111 for Random Forest at the calibrated and first-versus-second-half settings, with 5–11 of the 11 real repeats above the largest null repeat. The row-block gaps also remain when both contexts are explained on the same records: across the three common record sets they are 0.063–0.072 (calibrated) and 0.031–0.032 (first versus second half) for XGBoost and 0.107–0.119 and 0.061–0.071 for Random Forest, positive in 10–11 of the 11 repeats; for Random Forest this is 22–35% below the gaps on each context's own records. For clusters, the two versions of the null point in the directions expected from their construction. In the flow-level version, cross-context agreement exceeds within-context agreement (0.863 against 0.821 on average), so </w:t>
+      </w:r>
+      <ns0:oMath xmlns:ns0="http://schemas.openxmlformats.org/officeDocument/2006/math">
+        <ns0:r>
+          <w:rPr>
+            <w:rFonts w:ascii="Cambria Math" w:hAnsi="Cambria Math"/>
+          </w:rPr>
+          <ns0:t>Δ</ns0:t>
+        </ns0:r>
+      </ns0:oMath>
+      <w:r>
+        <w:rPr/>
+        <w:t xml:space="preserve"> is negative (-0.095 to -0.009). In the group-level version, the pseudo-contexts agree less with each other than the real contexts do in all six model and cluster settings (for Random Forest with clusters of about 10 flows, cross-context </w:t>
+      </w:r>
+      <ns0:oMath xmlns:ns0="http://schemas.openxmlformats.org/officeDocument/2006/math">
+        <ns0:r>
+          <w:rPr>
+            <w:rFonts w:ascii="Cambria Math" w:hAnsi="Cambria Math"/>
+          </w:rPr>
+          <ns0:t>ρ</ns0:t>
+        </ns0:r>
+      </ns0:oMath>
+      <w:r>
+        <w:rPr/>
+        <w:t xml:space="preserve"> 0.600 against 0.730), so </w:t>
+      </w:r>
+      <ns0:oMath xmlns:ns0="http://schemas.openxmlformats.org/officeDocument/2006/math">
+        <ns0:r>
+          <w:rPr>
+            <w:rFonts w:ascii="Cambria Math" w:hAnsi="Cambria Math"/>
+          </w:rPr>
+          <ns0:t>Δ</ns0:t>
+        </ns0:r>
+      </ns0:oMath>
+      <w:r>
+        <w:rPr/>
+        <w:t xml:space="preserve"> is positive (0.040 to 0.265), with a spread across repeats of up to 0.184. The real cluster gaps (0.014 to 0.100) lie between the two versions for every model and cluster setting, in some close to the group-level null (XGBoost with about 10 flows: 0.079 against 0.097). No neutral null could be built for feature clusters, so the cluster results do not show whether an excess remains once related flows are kept together.</w:t>
       </w:r>
     </w:p>
     <w:p>
@@ -13031,7 +13079,7 @@
       </w:pPr>
       <w:r>
         <w:rPr/>
-        <w:t xml:space="preserve">The grouped null sharpens the row-order end of this range: row-block grouping produces almost no gap by itself, so the positive row-block gaps are excess over the null, whereas for clusters the null itself is uncertain. Explaining both contexts on the same records leaves the XGBoost gap in place and removes about 21–28% of the Random Forest gap under random halves, so part of the Random Forest excess may reflect the explained records. None of this tests the excess at the level of captures: no grouped design keeps the test records apart from the training sessions, and both proxies only approximate capture boundaries. Part of the random-split gap therefore reflects variation between groups of related flows, and part of it survives every row-order grouping. In every design the outer 80/20 partition is random, and because the two contexts are different sets of captures, the remaining differences cannot be attributed to tunnelling.</w:t>
+        <w:t xml:space="preserve">The grouped null sharpens the row-order end of this range: at the two row-block settings tested, the grouping produces almost no gap by itself, and the real gaps stay positive on average when both contexts are explained on the same records, whereas for clusters the null itself is uncertain. Explaining both contexts on the same records leaves the XGBoost gap almost unchanged and lowers the Random Forest gap by about 21–28% under random halves and 22–35% under row blocks. None of this tests the excess at the level of captures: no grouped design keeps the test records apart from the training sessions, and both proxies only approximate capture boundaries. Part of the random-split gap therefore reflects variation between groups of related flows, and part of it survives the two row-block settings tested, on each context's own records and on common ones, although under the first-versus-second-half split the XGBoost gap is small and the RBO and Top-5 gaps are negative in some repeats. In every design the outer 80/20 partition is random, and because the two contexts are different sets of captures, the remaining differences cannot be attributed to tunnelling.</w:t>
       </w:r>
     </w:p>
     <w:p>
@@ -16729,7 +16777,7 @@
                 <w:sz w:val="17"/>
                 <w:szCs w:val="17"/>
               </w:rPr>
-              <w:t xml:space="preserve">0.676 / 0.689</w:t>
+              <w:t xml:space="preserve">0.609 / 0.646</w:t>
             </w:r>
           </w:p>
         </w:tc>
@@ -16754,7 +16802,7 @@
                 <w:sz w:val="17"/>
                 <w:szCs w:val="17"/>
               </w:rPr>
-              <w:t xml:space="preserve">0.860</w:t>
+              <w:t xml:space="preserve">0.831</w:t>
             </w:r>
           </w:p>
         </w:tc>
@@ -16779,7 +16827,7 @@
                 <w:sz w:val="17"/>
                 <w:szCs w:val="17"/>
               </w:rPr>
-              <w:t xml:space="preserve">0.853</w:t>
+              <w:t xml:space="preserve">0.845</w:t>
             </w:r>
           </w:p>
         </w:tc>
@@ -16804,7 +16852,7 @@
                 <w:sz w:val="17"/>
                 <w:szCs w:val="17"/>
               </w:rPr>
-              <w:t xml:space="preserve">0.892</w:t>
+              <w:t xml:space="preserve">0.866</w:t>
             </w:r>
           </w:p>
         </w:tc>
@@ -16829,22 +16877,22 @@
                 <w:sz w:val="17"/>
                 <w:szCs w:val="17"/>
               </w:rPr>
-              <w:t xml:space="preserve">-0.035 (0.021)</w:t>
-            </w:r>
-          </w:p>
-          <w:p>
-            <w:pPr>
-              <w:pStyle w:val="Normal"/>
-              <w:spacing w:lineRule="auto" w:line="228"/>
-              <w:jc w:val="center"/>
-              <w:rPr/>
-            </w:pPr>
-            <w:r>
-              <w:rPr>
-                <w:sz w:val="17"/>
-                <w:szCs w:val="17"/>
-              </w:rPr>
-              <w:t xml:space="preserve">-0.057 to 0.011</w:t>
+              <w:t xml:space="preserve">-0.028 (0.024)</w:t>
+            </w:r>
+          </w:p>
+          <w:p>
+            <w:pPr>
+              <w:pStyle w:val="Normal"/>
+              <w:spacing w:lineRule="auto" w:line="228"/>
+              <w:jc w:val="center"/>
+              <w:rPr/>
+            </w:pPr>
+            <w:r>
+              <w:rPr>
+                <w:sz w:val="17"/>
+                <w:szCs w:val="17"/>
+              </w:rPr>
+              <w:t xml:space="preserve">-0.064 to 0.002</w:t>
             </w:r>
           </w:p>
         </w:tc>
@@ -16869,7 +16917,7 @@
                 <w:sz w:val="17"/>
                 <w:szCs w:val="17"/>
               </w:rPr>
-              <w:t xml:space="preserve">-0.028</w:t>
+              <w:t xml:space="preserve">-0.053</w:t>
             </w:r>
           </w:p>
         </w:tc>
@@ -16894,7 +16942,7 @@
                 <w:sz w:val="17"/>
                 <w:szCs w:val="17"/>
               </w:rPr>
-              <w:t xml:space="preserve">-0.20</w:t>
+              <w:t xml:space="preserve">-0.55</w:t>
             </w:r>
           </w:p>
         </w:tc>
@@ -16919,7 +16967,7 @@
                 <w:sz w:val="17"/>
                 <w:szCs w:val="17"/>
               </w:rPr>
-              <w:t xml:space="preserve">-0.035</w:t>
+              <w:t xml:space="preserve">-0.027</w:t>
             </w:r>
           </w:p>
         </w:tc>
@@ -16973,7 +17021,7 @@
                 <w:sz w:val="17"/>
                 <w:szCs w:val="17"/>
               </w:rPr>
-              <w:t xml:space="preserve">0.799 / 0.817</w:t>
+              <w:t xml:space="preserve">0.788 / 0.798</w:t>
             </w:r>
           </w:p>
         </w:tc>
@@ -16998,7 +17046,7 @@
                 <w:sz w:val="17"/>
                 <w:szCs w:val="17"/>
               </w:rPr>
-              <w:t xml:space="preserve">0.927</w:t>
+              <w:t xml:space="preserve">0.920</w:t>
             </w:r>
           </w:p>
         </w:tc>
@@ -17023,7 +17071,7 @@
                 <w:sz w:val="17"/>
                 <w:szCs w:val="17"/>
               </w:rPr>
-              <w:t xml:space="preserve">0.934</w:t>
+              <w:t xml:space="preserve">0.933</w:t>
             </w:r>
           </w:p>
         </w:tc>
@@ -17073,22 +17121,22 @@
                 <w:sz w:val="17"/>
                 <w:szCs w:val="17"/>
               </w:rPr>
-              <w:t xml:space="preserve">0.000 (0.017)</w:t>
-            </w:r>
-          </w:p>
-          <w:p>
-            <w:pPr>
-              <w:pStyle w:val="Normal"/>
-              <w:spacing w:lineRule="auto" w:line="228"/>
-              <w:jc w:val="center"/>
-              <w:rPr/>
-            </w:pPr>
-            <w:r>
-              <w:rPr>
-                <w:sz w:val="17"/>
-                <w:szCs w:val="17"/>
-              </w:rPr>
-              <w:t xml:space="preserve">-0.025 to 0.039</w:t>
+              <w:t xml:space="preserve">-0.004 (0.009)</w:t>
+            </w:r>
+          </w:p>
+          <w:p>
+            <w:pPr>
+              <w:pStyle w:val="Normal"/>
+              <w:spacing w:lineRule="auto" w:line="228"/>
+              <w:jc w:val="center"/>
+              <w:rPr/>
+            </w:pPr>
+            <w:r>
+              <w:rPr>
+                <w:sz w:val="17"/>
+                <w:szCs w:val="17"/>
+              </w:rPr>
+              <w:t xml:space="preserve">-0.021 to 0.014</w:t>
             </w:r>
           </w:p>
         </w:tc>
@@ -17113,7 +17161,7 @@
                 <w:sz w:val="17"/>
                 <w:szCs w:val="17"/>
               </w:rPr>
-              <w:t xml:space="preserve">-0.002</w:t>
+              <w:t xml:space="preserve">-0.006</w:t>
             </w:r>
           </w:p>
         </w:tc>
@@ -17138,7 +17186,7 @@
                 <w:sz w:val="17"/>
                 <w:szCs w:val="17"/>
               </w:rPr>
-              <w:t xml:space="preserve">-0.09</w:t>
+              <w:t xml:space="preserve">+0.02</w:t>
             </w:r>
           </w:p>
         </w:tc>
@@ -17163,7 +17211,7 @@
                 <w:sz w:val="17"/>
                 <w:szCs w:val="17"/>
               </w:rPr>
-              <w:t xml:space="preserve">-0.002</w:t>
+              <w:t xml:space="preserve">-0.004</w:t>
             </w:r>
           </w:p>
         </w:tc>
@@ -17949,7 +17997,7 @@
                 <w:sz w:val="17"/>
                 <w:szCs w:val="17"/>
               </w:rPr>
-              <w:t xml:space="preserve">0.707 / 0.681</w:t>
+              <w:t xml:space="preserve">0.656 / 0.645</w:t>
             </w:r>
           </w:p>
         </w:tc>
@@ -17974,7 +18022,7 @@
                 <w:sz w:val="17"/>
                 <w:szCs w:val="17"/>
               </w:rPr>
-              <w:t xml:space="preserve">0.824</w:t>
+              <w:t xml:space="preserve">0.797</w:t>
             </w:r>
           </w:p>
         </w:tc>
@@ -17999,7 +18047,7 @@
                 <w:sz w:val="17"/>
                 <w:szCs w:val="17"/>
               </w:rPr>
-              <w:t xml:space="preserve">0.845</w:t>
+              <w:t xml:space="preserve">0.814</w:t>
             </w:r>
           </w:p>
         </w:tc>
@@ -18024,7 +18072,7 @@
                 <w:sz w:val="17"/>
                 <w:szCs w:val="17"/>
               </w:rPr>
-              <w:t xml:space="preserve">0.794</w:t>
+              <w:t xml:space="preserve">0.766</w:t>
             </w:r>
           </w:p>
         </w:tc>
@@ -18049,22 +18097,22 @@
                 <w:sz w:val="17"/>
                 <w:szCs w:val="17"/>
               </w:rPr>
-              <w:t xml:space="preserve">+0.041 (0.059)</w:t>
-            </w:r>
-          </w:p>
-          <w:p>
-            <w:pPr>
-              <w:pStyle w:val="Normal"/>
-              <w:spacing w:lineRule="auto" w:line="228"/>
-              <w:jc w:val="center"/>
-              <w:rPr/>
-            </w:pPr>
-            <w:r>
-              <w:rPr>
-                <w:sz w:val="17"/>
-                <w:szCs w:val="17"/>
-              </w:rPr>
-              <w:t xml:space="preserve">-0.058 to 0.181</w:t>
+              <w:t xml:space="preserve">+0.040 (0.075)</w:t>
+            </w:r>
+          </w:p>
+          <w:p>
+            <w:pPr>
+              <w:pStyle w:val="Normal"/>
+              <w:spacing w:lineRule="auto" w:line="228"/>
+              <w:jc w:val="center"/>
+              <w:rPr/>
+            </w:pPr>
+            <w:r>
+              <w:rPr>
+                <w:sz w:val="17"/>
+                <w:szCs w:val="17"/>
+              </w:rPr>
+              <w:t xml:space="preserve">-0.061 to 0.234</w:t>
             </w:r>
           </w:p>
         </w:tc>
@@ -18089,7 +18137,7 @@
                 <w:sz w:val="17"/>
                 <w:szCs w:val="17"/>
               </w:rPr>
-              <w:t xml:space="preserve">+0.036</w:t>
+              <w:t xml:space="preserve">+0.040</w:t>
             </w:r>
           </w:p>
         </w:tc>
@@ -18114,7 +18162,7 @@
                 <w:sz w:val="17"/>
                 <w:szCs w:val="17"/>
               </w:rPr>
-              <w:t xml:space="preserve">+0.27</w:t>
+              <w:t xml:space="preserve">+0.39</w:t>
             </w:r>
           </w:p>
         </w:tc>
@@ -18139,7 +18187,7 @@
                 <w:sz w:val="17"/>
                 <w:szCs w:val="17"/>
               </w:rPr>
-              <w:t xml:space="preserve">+0.039</w:t>
+              <w:t xml:space="preserve">+0.041</w:t>
             </w:r>
           </w:p>
         </w:tc>
@@ -18193,7 +18241,7 @@
                 <w:sz w:val="17"/>
                 <w:szCs w:val="17"/>
               </w:rPr>
-              <w:t xml:space="preserve">0.829 / 0.838</w:t>
+              <w:t xml:space="preserve">0.799 / 0.804</w:t>
             </w:r>
           </w:p>
         </w:tc>
@@ -18218,7 +18266,7 @@
                 <w:sz w:val="17"/>
                 <w:szCs w:val="17"/>
               </w:rPr>
-              <w:t xml:space="preserve">0.922</w:t>
+              <w:t xml:space="preserve">0.918</w:t>
             </w:r>
           </w:p>
         </w:tc>
@@ -18243,7 +18291,7 @@
                 <w:sz w:val="17"/>
                 <w:szCs w:val="17"/>
               </w:rPr>
-              <w:t xml:space="preserve">0.927</w:t>
+              <w:t xml:space="preserve">0.910</w:t>
             </w:r>
           </w:p>
         </w:tc>
@@ -18268,7 +18316,7 @@
                 <w:sz w:val="17"/>
                 <w:szCs w:val="17"/>
               </w:rPr>
-              <w:t xml:space="preserve">0.914</w:t>
+              <w:t xml:space="preserve">0.908</w:t>
             </w:r>
           </w:p>
         </w:tc>
@@ -18293,22 +18341,22 @@
                 <w:sz w:val="17"/>
                 <w:szCs w:val="17"/>
               </w:rPr>
-              <w:t xml:space="preserve">+0.011 (0.020)</w:t>
-            </w:r>
-          </w:p>
-          <w:p>
-            <w:pPr>
-              <w:pStyle w:val="Normal"/>
-              <w:spacing w:lineRule="auto" w:line="228"/>
-              <w:jc w:val="center"/>
-              <w:rPr/>
-            </w:pPr>
-            <w:r>
-              <w:rPr>
-                <w:sz w:val="17"/>
-                <w:szCs w:val="17"/>
-              </w:rPr>
-              <w:t xml:space="preserve">-0.030 to 0.040</w:t>
+              <w:t xml:space="preserve">+0.006 (0.022)</w:t>
+            </w:r>
+          </w:p>
+          <w:p>
+            <w:pPr>
+              <w:pStyle w:val="Normal"/>
+              <w:spacing w:lineRule="auto" w:line="228"/>
+              <w:jc w:val="center"/>
+              <w:rPr/>
+            </w:pPr>
+            <w:r>
+              <w:rPr>
+                <w:sz w:val="17"/>
+                <w:szCs w:val="17"/>
+              </w:rPr>
+              <w:t xml:space="preserve">-0.024 to 0.050</w:t>
             </w:r>
           </w:p>
         </w:tc>
@@ -18333,7 +18381,7 @@
                 <w:sz w:val="17"/>
                 <w:szCs w:val="17"/>
               </w:rPr>
-              <w:t xml:space="preserve">+0.009</w:t>
+              <w:t xml:space="preserve">+0.014</w:t>
             </w:r>
           </w:p>
         </w:tc>
@@ -18358,7 +18406,7 @@
                 <w:sz w:val="17"/>
                 <w:szCs w:val="17"/>
               </w:rPr>
-              <w:t xml:space="preserve">+0.09</w:t>
+              <w:t xml:space="preserve">+0.18</w:t>
             </w:r>
           </w:p>
         </w:tc>
@@ -18383,7 +18431,7 @@
                 <w:sz w:val="17"/>
                 <w:szCs w:val="17"/>
               </w:rPr>
-              <w:t xml:space="preserve">+0.007</w:t>
+              <w:t xml:space="preserve">+0.005</w:t>
             </w:r>
           </w:p>
         </w:tc>
@@ -21887,7 +21935,7 @@
                 <w:sz w:val="17"/>
                 <w:szCs w:val="17"/>
               </w:rPr>
-              <w:t xml:space="preserve">0.654 / 0.661</w:t>
+              <w:t xml:space="preserve">0.594 / 0.625</w:t>
             </w:r>
           </w:p>
         </w:tc>
@@ -21912,7 +21960,7 @@
                 <w:sz w:val="17"/>
                 <w:szCs w:val="17"/>
               </w:rPr>
-              <w:t xml:space="preserve">0.801</w:t>
+              <w:t xml:space="preserve">0.689</w:t>
             </w:r>
           </w:p>
         </w:tc>
@@ -21937,7 +21985,7 @@
                 <w:sz w:val="17"/>
                 <w:szCs w:val="17"/>
               </w:rPr>
-              <w:t xml:space="preserve">0.741</w:t>
+              <w:t xml:space="preserve">0.693</w:t>
             </w:r>
           </w:p>
         </w:tc>
@@ -21962,7 +22010,7 @@
                 <w:sz w:val="17"/>
                 <w:szCs w:val="17"/>
               </w:rPr>
-              <w:t xml:space="preserve">0.818</w:t>
+              <w:t xml:space="preserve">0.786</w:t>
             </w:r>
           </w:p>
         </w:tc>
@@ -21987,22 +22035,22 @@
                 <w:sz w:val="17"/>
                 <w:szCs w:val="17"/>
               </w:rPr>
-              <w:t xml:space="preserve">-0.048 (0.036)</w:t>
-            </w:r>
-          </w:p>
-          <w:p>
-            <w:pPr>
-              <w:pStyle w:val="Normal"/>
-              <w:spacing w:lineRule="auto" w:line="228"/>
-              <w:jc w:val="center"/>
-              <w:rPr/>
-            </w:pPr>
-            <w:r>
-              <w:rPr>
-                <w:sz w:val="17"/>
-                <w:szCs w:val="17"/>
-              </w:rPr>
-              <w:t xml:space="preserve">-0.101 to 0.029</w:t>
+              <w:t xml:space="preserve">-0.095 (0.042)</w:t>
+            </w:r>
+          </w:p>
+          <w:p>
+            <w:pPr>
+              <w:pStyle w:val="Normal"/>
+              <w:spacing w:lineRule="auto" w:line="228"/>
+              <w:jc w:val="center"/>
+              <w:rPr/>
+            </w:pPr>
+            <w:r>
+              <w:rPr>
+                <w:sz w:val="17"/>
+                <w:szCs w:val="17"/>
+              </w:rPr>
+              <w:t xml:space="preserve">-0.193 to -0.034</w:t>
             </w:r>
           </w:p>
         </w:tc>
@@ -22027,7 +22075,7 @@
                 <w:sz w:val="17"/>
                 <w:szCs w:val="17"/>
               </w:rPr>
-              <w:t xml:space="preserve">-0.067</w:t>
+              <w:t xml:space="preserve">-0.111</w:t>
             </w:r>
           </w:p>
         </w:tc>
@@ -22052,7 +22100,7 @@
                 <w:sz w:val="17"/>
                 <w:szCs w:val="17"/>
               </w:rPr>
-              <w:t xml:space="preserve">-0.70</w:t>
+              <w:t xml:space="preserve">-1.00</w:t>
             </w:r>
           </w:p>
         </w:tc>
@@ -22077,7 +22125,7 @@
                 <w:sz w:val="17"/>
                 <w:szCs w:val="17"/>
               </w:rPr>
-              <w:t xml:space="preserve">-0.061</w:t>
+              <w:t xml:space="preserve">-0.093</w:t>
             </w:r>
           </w:p>
         </w:tc>
@@ -22131,7 +22179,7 @@
                 <w:sz w:val="17"/>
                 <w:szCs w:val="17"/>
               </w:rPr>
-              <w:t xml:space="preserve">0.776 / 0.794</w:t>
+              <w:t xml:space="preserve">0.770 / 0.778</w:t>
             </w:r>
           </w:p>
         </w:tc>
@@ -22156,7 +22204,7 @@
                 <w:sz w:val="17"/>
                 <w:szCs w:val="17"/>
               </w:rPr>
-              <w:t xml:space="preserve">0.920</w:t>
+              <w:t xml:space="preserve">0.899</w:t>
             </w:r>
           </w:p>
         </w:tc>
@@ -22181,7 +22229,7 @@
                 <w:sz w:val="17"/>
                 <w:szCs w:val="17"/>
               </w:rPr>
-              <w:t xml:space="preserve">0.928</w:t>
+              <w:t xml:space="preserve">0.894</w:t>
             </w:r>
           </w:p>
         </w:tc>
@@ -22206,7 +22254,7 @@
                 <w:sz w:val="17"/>
                 <w:szCs w:val="17"/>
               </w:rPr>
-              <w:t xml:space="preserve">0.918</w:t>
+              <w:t xml:space="preserve">0.904</w:t>
             </w:r>
           </w:p>
         </w:tc>
@@ -22231,22 +22279,22 @@
                 <w:sz w:val="17"/>
                 <w:szCs w:val="17"/>
               </w:rPr>
-              <w:t xml:space="preserve">+0.006 (0.014)</w:t>
-            </w:r>
-          </w:p>
-          <w:p>
-            <w:pPr>
-              <w:pStyle w:val="Normal"/>
-              <w:spacing w:lineRule="auto" w:line="228"/>
-              <w:jc w:val="center"/>
-              <w:rPr/>
-            </w:pPr>
-            <w:r>
-              <w:rPr>
-                <w:sz w:val="17"/>
-                <w:szCs w:val="17"/>
-              </w:rPr>
-              <w:t xml:space="preserve">-0.014 to 0.024</w:t>
+              <w:t xml:space="preserve">-0.007 (0.025)</w:t>
+            </w:r>
+          </w:p>
+          <w:p>
+            <w:pPr>
+              <w:pStyle w:val="Normal"/>
+              <w:spacing w:lineRule="auto" w:line="228"/>
+              <w:jc w:val="center"/>
+              <w:rPr/>
+            </w:pPr>
+            <w:r>
+              <w:rPr>
+                <w:sz w:val="17"/>
+                <w:szCs w:val="17"/>
+              </w:rPr>
+              <w:t xml:space="preserve">-0.053 to 0.030</w:t>
             </w:r>
           </w:p>
         </w:tc>
@@ -22271,7 +22319,7 @@
                 <w:sz w:val="17"/>
                 <w:szCs w:val="17"/>
               </w:rPr>
-              <w:t xml:space="preserve">+0.031</w:t>
+              <w:t xml:space="preserve">+0.021</w:t>
             </w:r>
           </w:p>
         </w:tc>
@@ -22296,7 +22344,7 @@
                 <w:sz w:val="17"/>
                 <w:szCs w:val="17"/>
               </w:rPr>
-              <w:t xml:space="preserve">0.00</w:t>
+              <w:t xml:space="preserve">-0.02</w:t>
             </w:r>
           </w:p>
         </w:tc>
@@ -22321,7 +22369,7 @@
                 <w:sz w:val="17"/>
                 <w:szCs w:val="17"/>
               </w:rPr>
-              <w:t xml:space="preserve">+0.003</w:t>
+              <w:t xml:space="preserve">-0.010</w:t>
             </w:r>
           </w:p>
         </w:tc>
@@ -23107,7 +23155,7 @@
                 <w:sz w:val="17"/>
                 <w:szCs w:val="17"/>
               </w:rPr>
-              <w:t xml:space="preserve">0.685 / 0.658</w:t>
+              <w:t xml:space="preserve">0.631 / 0.624</w:t>
             </w:r>
           </w:p>
         </w:tc>
@@ -23132,7 +23180,7 @@
                 <w:sz w:val="17"/>
                 <w:szCs w:val="17"/>
               </w:rPr>
-              <w:t xml:space="preserve">0.633</w:t>
+              <w:t xml:space="preserve">0.514</w:t>
             </w:r>
           </w:p>
         </w:tc>
@@ -23157,7 +23205,7 @@
                 <w:sz w:val="17"/>
                 <w:szCs w:val="17"/>
               </w:rPr>
-              <w:t xml:space="preserve">0.671</w:t>
+              <w:t xml:space="preserve">0.589</w:t>
             </w:r>
           </w:p>
         </w:tc>
@@ -23182,7 +23230,7 @@
                 <w:sz w:val="17"/>
                 <w:szCs w:val="17"/>
               </w:rPr>
-              <w:t xml:space="preserve">0.582</w:t>
+              <w:t xml:space="preserve">0.472</w:t>
             </w:r>
           </w:p>
         </w:tc>
@@ -23207,22 +23255,22 @@
                 <w:sz w:val="17"/>
                 <w:szCs w:val="17"/>
               </w:rPr>
-              <w:t xml:space="preserve">+0.071 (0.096)</w:t>
-            </w:r>
-          </w:p>
-          <w:p>
-            <w:pPr>
-              <w:pStyle w:val="Normal"/>
-              <w:spacing w:lineRule="auto" w:line="228"/>
-              <w:jc w:val="center"/>
-              <w:rPr/>
-            </w:pPr>
-            <w:r>
-              <w:rPr>
-                <w:sz w:val="17"/>
-                <w:szCs w:val="17"/>
-              </w:rPr>
-              <w:t xml:space="preserve">-0.065 to 0.237</w:t>
+              <w:t xml:space="preserve">+0.080 (0.132)</w:t>
+            </w:r>
+          </w:p>
+          <w:p>
+            <w:pPr>
+              <w:pStyle w:val="Normal"/>
+              <w:spacing w:lineRule="auto" w:line="228"/>
+              <w:jc w:val="center"/>
+              <w:rPr/>
+            </w:pPr>
+            <w:r>
+              <w:rPr>
+                <w:sz w:val="17"/>
+                <w:szCs w:val="17"/>
+              </w:rPr>
+              <w:t xml:space="preserve">-0.097 to 0.356</w:t>
             </w:r>
           </w:p>
         </w:tc>
@@ -23247,7 +23295,7 @@
                 <w:sz w:val="17"/>
                 <w:szCs w:val="17"/>
               </w:rPr>
-              <w:t xml:space="preserve">+0.099</w:t>
+              <w:t xml:space="preserve">+0.070</w:t>
             </w:r>
           </w:p>
         </w:tc>
@@ -23272,7 +23320,7 @@
                 <w:sz w:val="17"/>
                 <w:szCs w:val="17"/>
               </w:rPr>
-              <w:t xml:space="preserve">+1.05</w:t>
+              <w:t xml:space="preserve">+0.55</w:t>
             </w:r>
           </w:p>
         </w:tc>
@@ -23297,7 +23345,7 @@
                 <w:sz w:val="17"/>
                 <w:szCs w:val="17"/>
               </w:rPr>
-              <w:t xml:space="preserve">+0.060</w:t>
+              <w:t xml:space="preserve">+0.070</w:t>
             </w:r>
           </w:p>
         </w:tc>
@@ -23351,7 +23399,7 @@
                 <w:sz w:val="17"/>
                 <w:szCs w:val="17"/>
               </w:rPr>
-              <w:t xml:space="preserve">0.809 / 0.815</w:t>
+              <w:t xml:space="preserve">0.782 / 0.784</w:t>
             </w:r>
           </w:p>
         </w:tc>
@@ -23376,7 +23424,7 @@
                 <w:sz w:val="17"/>
                 <w:szCs w:val="17"/>
               </w:rPr>
-              <w:t xml:space="preserve">0.926</w:t>
+              <w:t xml:space="preserve">0.914</w:t>
             </w:r>
           </w:p>
         </w:tc>
@@ -23401,7 +23449,7 @@
                 <w:sz w:val="17"/>
                 <w:szCs w:val="17"/>
               </w:rPr>
-              <w:t xml:space="preserve">0.910</w:t>
+              <w:t xml:space="preserve">0.889</w:t>
             </w:r>
           </w:p>
         </w:tc>
@@ -23426,7 +23474,7 @@
                 <w:sz w:val="17"/>
                 <w:szCs w:val="17"/>
               </w:rPr>
-              <w:t xml:space="preserve">0.886</w:t>
+              <w:t xml:space="preserve">0.878</w:t>
             </w:r>
           </w:p>
         </w:tc>
@@ -23451,22 +23499,22 @@
                 <w:sz w:val="17"/>
                 <w:szCs w:val="17"/>
               </w:rPr>
-              <w:t xml:space="preserve">+0.032 (0.025)</w:t>
-            </w:r>
-          </w:p>
-          <w:p>
-            <w:pPr>
-              <w:pStyle w:val="Normal"/>
-              <w:spacing w:lineRule="auto" w:line="228"/>
-              <w:jc w:val="center"/>
-              <w:rPr/>
-            </w:pPr>
-            <w:r>
-              <w:rPr>
-                <w:sz w:val="17"/>
-                <w:szCs w:val="17"/>
-              </w:rPr>
-              <w:t xml:space="preserve">-0.009 to 0.079</w:t>
+              <w:t xml:space="preserve">+0.023 (0.031)</w:t>
+            </w:r>
+          </w:p>
+          <w:p>
+            <w:pPr>
+              <w:pStyle w:val="Normal"/>
+              <w:spacing w:lineRule="auto" w:line="228"/>
+              <w:jc w:val="center"/>
+              <w:rPr/>
+            </w:pPr>
+            <w:r>
+              <w:rPr>
+                <w:sz w:val="17"/>
+                <w:szCs w:val="17"/>
+              </w:rPr>
+              <w:t xml:space="preserve">-0.043 to 0.060</w:t>
             </w:r>
           </w:p>
         </w:tc>
@@ -23491,7 +23539,7 @@
                 <w:sz w:val="17"/>
                 <w:szCs w:val="17"/>
               </w:rPr>
-              <w:t xml:space="preserve">+0.049</w:t>
+              <w:t xml:space="preserve">+0.045</w:t>
             </w:r>
           </w:p>
         </w:tc>
@@ -23516,7 +23564,7 @@
                 <w:sz w:val="17"/>
                 <w:szCs w:val="17"/>
               </w:rPr>
-              <w:t xml:space="preserve">+0.36</w:t>
+              <w:t xml:space="preserve">+0.34</w:t>
             </w:r>
           </w:p>
         </w:tc>
@@ -23541,7 +23589,7 @@
                 <w:sz w:val="17"/>
                 <w:szCs w:val="17"/>
               </w:rPr>
-              <w:t xml:space="preserve">+0.041</w:t>
+              <w:t xml:space="preserve">+0.022</w:t>
             </w:r>
           </w:p>
         </w:tc>
@@ -23828,7 +23876,7 @@
           <w:sz w:val="17"/>
           <w:szCs w:val="17"/>
         </w:rPr>
-        <w:t xml:space="preserve"> is the within value minus the cross value, averaged over repeats; SD and range describe its spread across repeats and are not standard errors. Half-model F1 is macro F1 on the repeat's test partition. Grouped designs keep whole k-means clusters (fitted within class on log(x + 2)-standardised features) in one half of the training partition; the calibrated design sets the number of clusters per class to that class's number of capture files (Section IV-D). Row-block designs keep whole blocks of consecutive rows of the original ARFF files (within class) in one half. The null design pools the flows of each class across contexts and reassigns them at random, without replacement, to pseudo-contexts with the original class counts. Rows marked Null (flows) apply a grouped design to those pseudo-contexts; rows marked Null (groups) build the pseudo-contexts from whole calibrated clusters or row blocks first (Section IV-D). Random Forest half-models are explained on 800 test records per repeat (their macro F1 uses the full test partition).</w:t>
+        <w:t xml:space="preserve"> is the within value minus the cross value, averaged over repeats; SD and range describe its spread across repeats and are not standard errors. Half-model F1 is macro F1 on the repeat's test partition. Grouped designs keep whole k-means clusters (fitted within class on log(x + 2)-standardised features) in one half of the training partition; the calibrated design sets the number of clusters per class to that class's number of capture files (Section IV-D). Row-block designs keep whole blocks of consecutive rows of the original ARFF files (within class) in one half. The null design pools the flows of each class across contexts and reassigns them at random, without replacement, to pseudo-contexts with the original class counts. Rows marked Null (flows) apply a grouped design to those pseudo-contexts; rows marked Null (groups) build the pseudo-contexts from whole calibrated clusters or row blocks first, so their class counts match the original ones only approximately (Section IV-D). Random Forest half-models are explained on 800 test records per repeat (their macro F1 uses the full test partition).</w:t>
       </w:r>
     </w:p>
     <w:p>
@@ -36513,7 +36561,7 @@
                 <w:sz w:val="17"/>
                 <w:szCs w:val="17"/>
               </w:rPr>
-              <w:t>-0.002 (0.009)</w:t>
+              <w:t xml:space="preserve">-0.001 (0.009)</w:t>
             </w:r>
           </w:p>
         </w:tc>
@@ -37099,6 +37147,342 @@
                 <w:szCs w:val="17"/>
               </w:rPr>
               <w:t>VI-C</w:t>
+            </w:r>
+          </w:p>
+        </w:tc>
+      </w:tr>
+      <w:tr>
+        <w:trPr>
+          <w:cantSplit w:val="true"/>
+        </w:trPr>
+        <w:tc>
+          <w:tcPr>
+            <w:tcW w:w="4299" w:type="dxa"/>
+            <w:tcBorders>
+              <w:top w:val="single" w:sz="6" w:space="0" w:color="000000"/>
+              <w:bottom w:val="single" w:sz="6" w:space="0" w:color="000000"/>
+            </w:tcBorders>
+            <w:vAlign w:val="center"/>
+          </w:tcPr>
+          <w:p>
+            <w:pPr>
+              <w:pStyle w:val="Normal"/>
+              <w:spacing w:lineRule="auto" w:line="228"/>
+              <w:rPr/>
+            </w:pPr>
+            <w:r>
+              <w:rPr/>
+            </w:r>
+            <m:oMath xmlns:m="http://schemas.openxmlformats.org/officeDocument/2006/math">
+              <m:r>
+                <m:t xml:space="preserve">Δρ</m:t>
+              </m:r>
+            </m:oMath>
+            <w:r>
+              <w:rPr>
+                <w:sz w:val="17"/>
+                <w:szCs w:val="17"/>
+              </w:rPr>
+              <w:t xml:space="preserve">, random halves on common records (range)</w:t>
+            </w:r>
+          </w:p>
+        </w:tc>
+        <w:tc>
+          <w:tcPr>
+            <w:tcW w:w="1950" w:type="dxa"/>
+            <w:tcBorders>
+              <w:top w:val="single" w:sz="6" w:space="0" w:color="000000"/>
+              <w:bottom w:val="single" w:sz="6" w:space="0" w:color="000000"/>
+            </w:tcBorders>
+            <w:vAlign w:val="center"/>
+          </w:tcPr>
+          <w:p>
+            <w:pPr>
+              <w:pStyle w:val="Normal"/>
+              <w:spacing w:lineRule="auto" w:line="228"/>
+              <w:jc w:val="center"/>
+              <w:rPr/>
+            </w:pPr>
+            <w:r>
+              <w:rPr>
+                <w:sz w:val="17"/>
+                <w:szCs w:val="17"/>
+              </w:rPr>
+              <w:t xml:space="preserve">0.134–0.147</w:t>
+            </w:r>
+          </w:p>
+        </w:tc>
+        <w:tc>
+          <w:tcPr>
+            <w:tcW w:w="1951" w:type="dxa"/>
+            <w:tcBorders>
+              <w:top w:val="single" w:sz="6" w:space="0" w:color="000000"/>
+              <w:bottom w:val="single" w:sz="6" w:space="0" w:color="000000"/>
+            </w:tcBorders>
+            <w:vAlign w:val="center"/>
+          </w:tcPr>
+          <w:p>
+            <w:pPr>
+              <w:pStyle w:val="Normal"/>
+              <w:spacing w:lineRule="auto" w:line="228"/>
+              <w:jc w:val="center"/>
+              <w:rPr/>
+            </w:pPr>
+            <w:r>
+              <w:rPr>
+                <w:sz w:val="17"/>
+                <w:szCs w:val="17"/>
+              </w:rPr>
+              <w:t xml:space="preserve">0.123–0.130</w:t>
+            </w:r>
+          </w:p>
+        </w:tc>
+        <w:tc>
+          <w:tcPr>
+            <w:tcW w:w="826" w:type="dxa"/>
+            <w:tcBorders>
+              <w:top w:val="single" w:sz="6" w:space="0" w:color="000000"/>
+              <w:bottom w:val="single" w:sz="6" w:space="0" w:color="000000"/>
+            </w:tcBorders>
+            <w:vAlign w:val="center"/>
+          </w:tcPr>
+          <w:p>
+            <w:pPr>
+              <w:pStyle w:val="Normal"/>
+              <w:spacing w:lineRule="auto" w:line="228"/>
+              <w:jc w:val="center"/>
+              <w:rPr/>
+            </w:pPr>
+            <w:r>
+              <w:rPr>
+                <w:sz w:val="17"/>
+                <w:szCs w:val="17"/>
+              </w:rPr>
+              <w:t xml:space="preserve">VI-C</w:t>
+            </w:r>
+          </w:p>
+        </w:tc>
+      </w:tr>
+      <w:tr>
+        <w:trPr>
+          <w:cantSplit w:val="true"/>
+        </w:trPr>
+        <w:tc>
+          <w:tcPr>
+            <w:tcW w:w="4299" w:type="dxa"/>
+            <w:tcBorders>
+              <w:top w:val="single" w:sz="6" w:space="0" w:color="000000"/>
+              <w:bottom w:val="single" w:sz="6" w:space="0" w:color="000000"/>
+            </w:tcBorders>
+            <w:vAlign w:val="center"/>
+          </w:tcPr>
+          <w:p>
+            <w:pPr>
+              <w:pStyle w:val="Normal"/>
+              <w:spacing w:lineRule="auto" w:line="228"/>
+              <w:rPr/>
+            </w:pPr>
+            <w:r>
+              <w:rPr/>
+            </w:r>
+            <m:oMath xmlns:m="http://schemas.openxmlformats.org/officeDocument/2006/math">
+              <m:r>
+                <m:t xml:space="preserve">Δρ</m:t>
+              </m:r>
+            </m:oMath>
+            <w:r>
+              <w:rPr>
+                <w:sz w:val="17"/>
+                <w:szCs w:val="17"/>
+              </w:rPr>
+              <w:t xml:space="preserve">, row blocks calibrated / first vs second half, on common records (both test sets)</w:t>
+            </w:r>
+          </w:p>
+        </w:tc>
+        <w:tc>
+          <w:tcPr>
+            <w:tcW w:w="1950" w:type="dxa"/>
+            <w:tcBorders>
+              <w:top w:val="single" w:sz="6" w:space="0" w:color="000000"/>
+              <w:bottom w:val="single" w:sz="6" w:space="0" w:color="000000"/>
+            </w:tcBorders>
+            <w:vAlign w:val="center"/>
+          </w:tcPr>
+          <w:p>
+            <w:pPr>
+              <w:pStyle w:val="Normal"/>
+              <w:spacing w:lineRule="auto" w:line="228"/>
+              <w:jc w:val="center"/>
+              <w:rPr/>
+            </w:pPr>
+            <w:r>
+              <w:rPr>
+                <w:sz w:val="17"/>
+                <w:szCs w:val="17"/>
+              </w:rPr>
+              <w:t xml:space="preserve">+0.114 / +0.068</w:t>
+            </w:r>
+          </w:p>
+        </w:tc>
+        <w:tc>
+          <w:tcPr>
+            <w:tcW w:w="1951" w:type="dxa"/>
+            <w:tcBorders>
+              <w:top w:val="single" w:sz="6" w:space="0" w:color="000000"/>
+              <w:bottom w:val="single" w:sz="6" w:space="0" w:color="000000"/>
+            </w:tcBorders>
+            <w:vAlign w:val="center"/>
+          </w:tcPr>
+          <w:p>
+            <w:pPr>
+              <w:pStyle w:val="Normal"/>
+              <w:spacing w:lineRule="auto" w:line="228"/>
+              <w:jc w:val="center"/>
+              <w:rPr/>
+            </w:pPr>
+            <w:r>
+              <w:rPr>
+                <w:sz w:val="17"/>
+                <w:szCs w:val="17"/>
+              </w:rPr>
+              <w:t xml:space="preserve">+0.066 / +0.032</w:t>
+            </w:r>
+          </w:p>
+        </w:tc>
+        <w:tc>
+          <w:tcPr>
+            <w:tcW w:w="826" w:type="dxa"/>
+            <w:tcBorders>
+              <w:top w:val="single" w:sz="6" w:space="0" w:color="000000"/>
+              <w:bottom w:val="single" w:sz="6" w:space="0" w:color="000000"/>
+            </w:tcBorders>
+            <w:vAlign w:val="center"/>
+          </w:tcPr>
+          <w:p>
+            <w:pPr>
+              <w:pStyle w:val="Normal"/>
+              <w:spacing w:lineRule="auto" w:line="228"/>
+              <w:jc w:val="center"/>
+              <w:rPr/>
+            </w:pPr>
+            <w:r>
+              <w:rPr>
+                <w:sz w:val="17"/>
+                <w:szCs w:val="17"/>
+              </w:rPr>
+              <w:t xml:space="preserve">VI-C</w:t>
+            </w:r>
+          </w:p>
+        </w:tc>
+      </w:tr>
+      <w:tr>
+        <w:trPr>
+          <w:cantSplit w:val="true"/>
+        </w:trPr>
+        <w:tc>
+          <w:tcPr>
+            <w:tcW w:w="4299" w:type="dxa"/>
+            <w:tcBorders>
+              <w:top w:val="single" w:sz="6" w:space="0" w:color="000000"/>
+              <w:bottom w:val="single" w:sz="6" w:space="0" w:color="000000"/>
+            </w:tcBorders>
+            <w:vAlign w:val="center"/>
+          </w:tcPr>
+          <w:p>
+            <w:pPr>
+              <w:pStyle w:val="Normal"/>
+              <w:spacing w:lineRule="auto" w:line="228"/>
+              <w:rPr/>
+            </w:pPr>
+            <w:r>
+              <w:rPr/>
+            </w:r>
+            <m:oMath xmlns:m="http://schemas.openxmlformats.org/officeDocument/2006/math">
+              <m:r>
+                <m:t xml:space="preserve">Δρ</m:t>
+              </m:r>
+            </m:oMath>
+            <w:r>
+              <w:rPr>
+                <w:sz w:val="17"/>
+                <w:szCs w:val="17"/>
+              </w:rPr>
+              <w:t xml:space="preserve"> minus group-level null, row blocks calibrated / first vs second half</w:t>
+            </w:r>
+          </w:p>
+        </w:tc>
+        <w:tc>
+          <w:tcPr>
+            <w:tcW w:w="1950" w:type="dxa"/>
+            <w:tcBorders>
+              <w:top w:val="single" w:sz="6" w:space="0" w:color="000000"/>
+              <w:bottom w:val="single" w:sz="6" w:space="0" w:color="000000"/>
+            </w:tcBorders>
+            <w:vAlign w:val="center"/>
+          </w:tcPr>
+          <w:p>
+            <w:pPr>
+              <w:pStyle w:val="Normal"/>
+              <w:spacing w:lineRule="auto" w:line="228"/>
+              <w:jc w:val="center"/>
+              <w:rPr/>
+            </w:pPr>
+            <w:r>
+              <w:rPr>
+                <w:sz w:val="17"/>
+                <w:szCs w:val="17"/>
+              </w:rPr>
+              <w:t xml:space="preserve">+0.130 / +0.111</w:t>
+            </w:r>
+          </w:p>
+        </w:tc>
+        <w:tc>
+          <w:tcPr>
+            <w:tcW w:w="1951" w:type="dxa"/>
+            <w:tcBorders>
+              <w:top w:val="single" w:sz="6" w:space="0" w:color="000000"/>
+              <w:bottom w:val="single" w:sz="6" w:space="0" w:color="000000"/>
+            </w:tcBorders>
+            <w:vAlign w:val="center"/>
+          </w:tcPr>
+          <w:p>
+            <w:pPr>
+              <w:pStyle w:val="Normal"/>
+              <w:spacing w:lineRule="auto" w:line="228"/>
+              <w:jc w:val="center"/>
+              <w:rPr/>
+            </w:pPr>
+            <w:r>
+              <w:rPr>
+                <w:sz w:val="17"/>
+                <w:szCs w:val="17"/>
+              </w:rPr>
+              <w:t xml:space="preserve">+0.069 / +0.035</w:t>
+            </w:r>
+          </w:p>
+        </w:tc>
+        <w:tc>
+          <w:tcPr>
+            <w:tcW w:w="826" w:type="dxa"/>
+            <w:tcBorders>
+              <w:top w:val="single" w:sz="6" w:space="0" w:color="000000"/>
+              <w:bottom w:val="single" w:sz="6" w:space="0" w:color="000000"/>
+            </w:tcBorders>
+            <w:vAlign w:val="center"/>
+          </w:tcPr>
+          <w:p>
+            <w:pPr>
+              <w:pStyle w:val="Normal"/>
+              <w:spacing w:lineRule="auto" w:line="228"/>
+              <w:jc w:val="center"/>
+              <w:rPr/>
+            </w:pPr>
+            <w:r>
+              <w:rPr>
+                <w:sz w:val="17"/>
+                <w:szCs w:val="17"/>
+              </w:rPr>
+              <w:t xml:space="preserve">VI-C</w:t>
             </w:r>
           </w:p>
         </w:tc>
@@ -37817,7 +38201,7 @@
       </w:r>
       <w:r>
         <w:rPr/>
-        <w:t xml:space="preserve">The answer to the question posed in the title depends on what cross-context agreement is compared with. Against models trained on random halves of one context, VPN and Non-VPN rankings disagree more, in every repeat, and the permutation null shows that neither the half-split procedure nor the class-mix difference produces such a gap. Keeping related flows together reduces the gap, but by how much depends on the proxy for related flows. Feature clusters eliminate most of it; at the settings that the capture counts point to the mean gap is near zero, but the half-models are weak, the gap varies widely, and for Random Forest the mean averages a gap of +0.23 on the Non-VPN side and -0.19 on the VPN side, and clusters also separate regions of feature space that a capture split would not. Blocks of consecutive rows in the original files are not built from the features, although row position is correlated with some of them, and they leave the half-models far more accurate than coarse clusters do. At the capture-calibrated setting they reduce the gap to 0.07 for XGBoost and 0.15 for Random Forest, and even the first-versus-second-half split leaves 0.03 and 0.09 on average. The Spearman gap stays at or above zero in every repeat, but the repeats reuse nearly the same halves, and the RBO and Top-5 gaps turn negative in some of them. The two proxies disagree, and neither is a capture split: clusters may overcorrect, and blocks may undercorrect or, at their strictest, also separate regions of feature space. Together they suggest that part of the random-split gap reflects variation between groups of related flows, from about 20% to nearly all of it depending on the proxy and model. Two further checks narrow this. Explaining both contexts on the same records leaves the XGBoost gap unchanged and lowers the Random Forest gap by about 21–28%, so the choice of explained records is not the main source of the disagreement. A grouped permutation null shows that row-block grouping produces almost no gap by itself, so the positive row-block gaps are excess over the null; for clusters, the two versions of the null fall on either side of the observed gap, and the cluster results leave the question open. Some excess therefore remains under the grouping least tied to the features, but its size depends on how closely row blocks follow captures, and without capture identifiers or an independent second capture it cannot be pinned down. Because the contexts are different sets of captures, it cannot be attributed to tunnelling. A random within-context split, which is the usual way such references are built, would have exaggerated it.</w:t>
+        <w:t xml:space="preserve">The answer to the question posed in the title depends on what cross-context agreement is compared with. Against models trained on random halves of one context, VPN and Non-VPN rankings disagree more, in every repeat, and the permutation null shows that neither the half-split procedure nor the class-mix difference produces such a gap. Keeping related flows together reduces the gap, but by how much depends on the proxy for related flows. Feature clusters eliminate most of it; at the settings that the capture counts point to the mean gap is near zero, but the half-models are weak, the gap varies widely, and for Random Forest the mean averages a gap of +0.23 on the Non-VPN side and -0.19 on the VPN side, and clusters also separate regions of feature space that a capture split would not. Blocks of consecutive rows in the original files are not built from the features, although row position is correlated with some of them, and they leave the half-models far more accurate than coarse clusters do. At the capture-calibrated setting they reduce the gap to 0.07 for XGBoost and 0.15 for Random Forest, and even the first-versus-second-half split leaves 0.03 and 0.09 on average. The Spearman gap stays at or above zero in every repeat, but the repeats reuse nearly the same halves, and the RBO and Top-5 gaps turn negative in some of them. The two proxies disagree, and neither is a capture split: clusters may overcorrect, and blocks may undercorrect or, at their strictest, also separate regions of feature space. Together they suggest that part of the random-split gap reflects variation between groups of related flows, from about 20% to nearly all of it depending on the proxy and model. Two further checks narrow this. Explaining both contexts on the same records leaves the XGBoost gap almost unchanged and lowers the Random Forest gap by about 21–28% under random halves and 22–35% under row blocks, so the choice of explained records is not the main source of the disagreement. A grouped permutation null, run for two row-block and three cluster settings, shows that row-block grouping produces almost no gap by itself, so the positive row-block gaps are excess over the null; for clusters, the two versions of the null fall on either side of the observed gap, and the cluster results leave the question open. Some excess therefore remains under the grouping least tied to the features, but its size depends on how closely row blocks follow captures, and without capture identifiers or an independent second capture it cannot be pinned down. Because the contexts are different sets of captures, it cannot be attributed to tunnelling. A random within-context split, which is the usual way such references are built, would have exaggerated it.</w:t>
       </w:r>
     </w:p>
     <w:p>
@@ -37884,7 +38268,7 @@
         <w:rPr>
           <w:lang w:val="en-US"/>
         </w:rPr>
-        <w:t xml:space="preserve">Correlated features complicate the interpretation of individual feature shifts. For XGBoost, the three minimum IATs maintain their combined importance share across contexts, whereas for Random Forest the block's combined SHAP share rises under VPN, although permuting or removing the block costs slightly less macro F1 under VPN than without it. At the family level, the XGBoost gap stays about the same under clusters of about ten flows, so related-flow redundancy explains it less clearly than it explains the feature-level gap (Section VII).</w:t>
+        <w:t xml:space="preserve">Correlated features complicate the interpretation of individual feature shifts. For XGBoost, the three minimum IATs maintain their combined importance share across contexts, whereas for Random Forest the block's combined SHAP share rises under VPN, although permuting or removing the block costs slightly less macro F1 under VPN than without it. At the family level, the XGBoost gap stays about the same under clusters of about ten flows, so related-flow redundancy explains it less clearly than it explains the feature-level gap, and family-level conclusions depend on the grouping rule and family sizes (Section VII).</w:t>
       </w:r>
     </w:p>
     <w:p>
@@ -37911,7 +38295,7 @@
         <w:rPr>
           <w:lang w:val="en-US"/>
         </w:rPr>
-        <w:t xml:space="preserve">The two consequence tests point in different directions. A trained model transfers poorly, with macro F1 dropping to 0.43–0.61 in the other context, whereas a SHAP-selected feature list transfers well. At k = 10 and k = 15, transferring a feature list reduces macro F1 by at most about 0.013 on average across selection seeds, with a maximum of 0.017 for an individual seed. For some target contexts, the transferred list performs better than the context-specific list. The test has limited power, however: the selection seeds yield only one to three distinct lists per model, context and k, each list is refitted once, and there is no equivalence margin, so the test rules out a large cost rather than showing that there is none.</w:t>
+        <w:t xml:space="preserve">The two consequence tests point in different directions. A trained model transfers poorly, with macro F1 dropping to 0.43–0.61 in the other context, whereas a SHAP-selected feature list transfers more reliably. At k = 10 and k = 15, transferring a feature list reduces macro F1 by at most about 0.013 on average across selection seeds, with a maximum of 0.017 for an individual seed. For some target contexts, the transferred list performs better than the context-specific list. The test has limited power, however: the selection seeds yield only one to three distinct lists per model, context and k, each list is refitted once, and there is no equivalence margin, so the test rules out a large cost rather than showing that there is none.</w:t>
       </w:r>
     </w:p>
     <w:p>
@@ -37955,7 +38339,7 @@
           <w:bCs w:val="false"/>
           <w:lang w:val="en-US"/>
         </w:rPr>
-        <w:t xml:space="preserve">An explanation report for a traffic classifier should specify the observation context, fitted model, attribution method, handling of undefined statistics, and aggregation rules. Claims of consistency should be checked against a reference in which the compared models do not share sessions, because randomly splitting dependent flows overstates within-context consistency. Rankings from two contexts should be computed on the same records, or the effect of the records measured, because here the explained records alone accounted for about 21–28% of the Random Forest gap. When explanations drive a decision, such as which features to keep, that decision should be tested on held-out data from the target context. Similar explanations alone do not guarantee that a deployed model will perform reliably in a different observation context.</w:t>
+        <w:t xml:space="preserve">An explanation report for a traffic classifier should specify the observation context, fitted model, attribution method, handling of undefined statistics, and aggregation rules. Claims of consistency should be checked against a reference in which the compared models do not share sessions, because randomly splitting dependent flows overstates within-context consistency. When rankings from two contexts are compared, it is worth checking how much of the difference comes from explaining the models on different records: under random halves this accounted for about 21–28% of the Random Forest gap here and for almost none of the XGBoost gap. Explaining a model on another context's records evaluates it away from its own data, so this is a diagnostic, not a better ranking. When explanations drive a decision, such as which features to keep, that decision should be tested on held-out data from the target context. Similar explanations alone do not guarantee that a deployed model will perform reliably in a different observation context.</w:t>
       </w:r>
     </w:p>
     <w:p>
@@ -37988,7 +38372,7 @@
       </w:r>
       <w:r>
         <w:rPr/>
-        <w:t xml:space="preserve"> This is the most serious limitation, and it bears directly on the main conclusion. The processed files have no session or capture identifiers, and so no reference in this paper is a true group split. Both groupings are proxies. Fine clusters may well allow related flows to cross the split, and coarse clusters also separate regions of feature space that a session split would not; at the settings the capture counts point to, the cluster half-models are weak. Blocks of consecutive rows are based on our inference, from the similarity of neighbouring rows, that the original files retain flows of one capture together; equal-sized blocks do not follow capture boundaries, and the first-versus-second-half split may also separate applications within a class. For VPN FT, MAIL, P2P and VOIP, adjacent rows are nearly as different as random rows, and BROWSING (no listed captures) and P2P (at most one listed capture per context) cannot be split by capture with the information available. The two proxies give different answers (a mean gap near zero against a positive mean gap), and the calibration from capture counts is rough. Only the division of training data into halves is grouped; the outer 80/20 split is random. The grouped null has no neutral form for clusters: reassigning single flows puts flows of one capture in both pseudo-contexts, and reassigning whole clusters makes the pseudo-contexts differ in feature space. For row blocks both versions agree, but they inherit the uncertainty about how well row blocks follow captures. Within-context pairs are explained on shared test records and cross-context pairs, in the designs themselves, are not; explaining both contexts on common records showed that this accounts for part of the Random Forest gap under random halves, so the Random Forest gaps of the grouped designs, which were not recomputed on common records, may slightly overstate the difference between the models. The size of the cross-context excess therefore depends on an unknown session structure. Regenerating flows from the raw captures and splitting by capture file, or using a second independent capture of both contexts, would settle this.</w:t>
+        <w:t xml:space="preserve"> This is the most serious limitation, and it bears directly on the main conclusion. The processed files have no session or capture identifiers, and so no reference in this paper is a true group split. Both groupings are proxies. Fine clusters may well allow related flows to cross the split, and coarse clusters also separate regions of feature space that a session split would not; at the settings the capture counts point to, the cluster half-models are weak. Blocks of consecutive rows are based on our inference, from the similarity of neighbouring rows, that the original files retain flows of one capture together; equal-sized blocks do not follow capture boundaries, and the first-versus-second-half split may also separate applications within a class. For VPN FT, MAIL, P2P and VOIP, adjacent rows are nearly as different as random rows, and BROWSING (no listed captures) and P2P (at most one listed capture per context) cannot be split by capture with the information available. The two proxies give different answers (a mean gap near zero against a positive mean gap), and the calibration from capture counts is rough. Only the division of training data into halves is grouped; the outer 80/20 split is random. The grouped null has no neutral form for clusters: reassigning single flows puts flows of one capture in both pseudo-contexts, and reassigning whole clusters makes the pseudo-contexts differ in feature space. For row blocks both versions agree, but they inherit the uncertainty about how well row blocks follow captures. The null was run for two of the five row-block settings and three of the four cluster settings. Within-context pairs are explained on shared test records and cross-context pairs, in the designs themselves, are not. Explaining both contexts on common records lowers the Random Forest gaps by about 21–28% under random halves and 22–35% under the two row-block settings, so Random Forest gaps measured on each context's own records overstate the difference between the models by roughly that much; the cluster designs and the other row-block settings were not recomputed on common records. The size of the cross-context excess therefore depends on an unknown session structure. Regenerating flows from the raw captures and splitting by capture file, or using a second independent capture of both contexts, would settle this.</w:t>
       </w:r>
     </w:p>
     <w:p>
@@ -38179,7 +38563,7 @@
       </w:pPr>
       <w:r>
         <w:rPr/>
-        <w:t xml:space="preserve">How large this disagreement is depends on the reference. Against random halves of one context, cross-context Spearman agreement is lower by 0.13 for XGBoost and 0.19 for Random Forest, and a permutation null that keeps both class mixes produces little or no gap. Explaining every model on the same records changes little for XGBoost and removes about 21–28% of the Random Forest gap. Keeping related flows in the same half reduces the gap further: to 0.08–0.10 with clusters of about 10 flows, to 0.01–0.04 with clusters of about 35, and to about zero on average at the capture-calibrated setting, where the half-models are weak and opposite gaps in the two contexts cancel. Blocks of consecutive rows in the original files leave 0.07 and 0.15 at the calibrated setting and 0.03 and 0.09 when each class is split into its first and second halves, and a grouped permutation null shows that row-block grouping produces almost no gap by itself. For feature clusters no neutral null could be built, so the cluster results leave open whether an excess remains.</w:t>
+        <w:t xml:space="preserve">How large this disagreement is depends on the reference. Against random halves of one context, cross-context Spearman agreement is lower by 0.13 for XGBoost and 0.19 for Random Forest, and a permutation null that keeps both class mixes produces little or no gap. Explaining the random-half models on the same records changes little for XGBoost and removes about 21–28% of the Random Forest gap. Keeping related flows in the same half also reduces the gap, measured on each context's own records: to 0.08–0.10 with clusters of about 10 flows, to 0.01–0.04 with clusters of about 35, and to about zero on average at the capture-calibrated setting, where the half-models are weak and opposite gaps in the two contexts cancel. Blocks of consecutive rows in the original files leave 0.07 and 0.15 at the calibrated setting and 0.03 and 0.09 when each class is split into its first and second halves. At these two settings the gaps remain when both contexts are explained on the same records, and a grouped permutation null shows that row-block grouping produces almost no gap by itself, although the RBO and Top-5 gaps are negative in some repeats of the first-versus-second-half split. For feature clusters no neutral null could be built, so the cluster results leave open whether an excess remains, and the top-weighted RBO gap and the XGBoost family-level gap shrink less under clusters than the Spearman gap does.</w:t>
       </w:r>
     </w:p>
     <w:p>
@@ -38205,7 +38589,7 @@
       </w:pPr>
       <w:r>
         <w:rPr/>
-        <w:t xml:space="preserve">On this benchmark, then, part of the random-split gap between SHAP rankings reflects variation between groups of related flows within a context, and part of it survives every row-order grouping. The two contexts are different sets of captures, so none of the remaining difference can be attributed to tunnelling, and the proxies used here cannot measure a true between-session effect. Captures that keep session identifiers, or an independent second capture of both contexts, would settle the question, and newer traffic and class-specific explanations would show whether the pattern holds beyond this benchmark.</w:t>
+        <w:t xml:space="preserve">On this benchmark, then, part of the random-split gap between SHAP rankings reflects variation between groups of related flows within a context, and part of it survives the row-order groupings tested, on each context's own records and on common ones. The two contexts are different sets of captures, so none of the remaining difference can be attributed to tunnelling, and the proxies used here cannot measure a true between-session effect. Captures that keep session identifiers, or an independent second capture of both contexts, would settle the question, and newer traffic and class-specific explanations would show whether the pattern holds beyond this benchmark.</w:t>
       </w:r>
     </w:p>
     <w:p>

</xml_diff>

<commit_message>
v14 final: second independent check (all 14 items fixed) and its five minor points fixed; all checks pass
</commit_message>
<xml_diff>
--- a/paper/SHAP_VPN_revised_v14.docx
+++ b/paper/SHAP_VPN_revised_v14.docx
@@ -258,7 +258,7 @@
       </w:r>
       <w:r>
         <w:rPr/>
-        <w:t xml:space="preserve">Global SHAP rankings are commonly interpreted as a guide to encrypted traffic, but a ranking learned in one observation context may not apply elsewhere. We evaluate this on the seven-class application task of the ISCX VPN-nonVPN benchmark, using TreeSHAP to explain Random Forest and XGBoost models trained separately on Non-VPN and VPN flows. Each model keeps only three of its five leading features when the observation context changes. Compared with models trained on random halves of one context, cross-context Spearman agreement is lower by 0.13 (XGBoost) and 0.19 (Random Forest), which a permutation null preserving both class mixes does not replicate. Keeping related flows in the same half reduces the gap by an amount that depends on the proxy for capture sessions: to about zero on average with clusters of similar flows roughly the size of the capture files, where the half-models are weak and opposite gaps in the two contexts cancel, but only to 0.07 and 0.15 with blocks of consecutive flows in the original files, and to 0.03 and 0.09 with first- and second-half splits. A model trained in one context reaches only 0.43–0.61 macro F1 in the other, while a SHAP-chosen Top-10 feature list loses little macro F1 when transferred, in a test of limited power. Part of the random-split gap reflects related flows; under row-block grouping a smaller gap remains on common explained records and above a grouped permutation null, but the contexts are different capture sets, so none of it can be attributed to tunnelling.</w:t>
+        <w:t xml:space="preserve">Global SHAP rankings are commonly interpreted as a guide to encrypted traffic, but a ranking learned in one observation context may not apply elsewhere. We evaluate this on the seven-class application task of the ISCX VPN-nonVPN benchmark, using TreeSHAP to explain Random Forest and XGBoost models trained separately on Non-VPN and VPN flows. Each model keeps only three of its five leading features across contexts. Compared with models trained on random halves of one context, cross-context Spearman agreement is lower by 0.13 (XGBoost) and 0.19 (Random Forest), which a permutation null preserving both class mixes does not replicate. Keeping related flows in the same half reduces the gap by an amount that depends on the proxy for capture sessions: to about zero on average with clusters of similar flows roughly the size of the capture files, where the half-models are weak and opposite gaps in the two contexts cancel, but only to 0.07 and 0.15 with blocks of consecutive flows in the original files, and to 0.03 and 0.09 with first- and second-half splits. A model trained in one context reaches only 0.43–0.61 macro F1 in the other, while a SHAP-chosen Top-10 feature list loses little macro F1 when transferred, in a test of limited power. Part of the random-split gap reflects related flows; at the two row-block settings tested, a smaller gap remains on common explained records and above a grouped permutation null, but the contexts are different capture sets, so none of it can be attributed to tunnelling.</w:t>
       </w:r>
     </w:p>
     <w:p>
@@ -7587,7 +7587,7 @@
       </ns0:oMath>
       <w:r>
         <w:rPr/>
-        <w:t xml:space="preserve"> down. In the group-level version, whole capture-sized groups move instead: within each class and source file, the pooled flows are divided into the calibrated clusters (for the cluster designs) or the calibrated row blocks (for the row-block designs), and the groups are taken in random order, each going to the pseudo-context that is further below its original share of the class. Because whole groups move, class counts are matched only approximately, and the halves hold 2,409–3,589 training flows, against 3,457–3,476 in the real grouped designs. Calibrated clusters are regions of feature space, so for the cluster designs this version also gives the two pseudo-contexts different feature distributions, which pushes </w:t>
+        <w:t xml:space="preserve"> down. In the group-level version, whole capture-sized groups move instead: within each class and source file, the pooled flows are divided into the calibrated clusters (for the cluster designs) or the calibrated row blocks (for the row-block designs), and the groups are taken in random order, each going to the pseudo-context that is further below its original share of the class. Because whole groups move, class counts are matched only approximately. Calibrated clusters are regions of feature space, so for the cluster designs this version also gives the two pseudo-contexts different feature distributions, which pushes </w:t>
       </w:r>
       <ns0:oMath xmlns:ns0="http://schemas.openxmlformats.org/officeDocument/2006/math">
         <ns0:r>
@@ -7599,7 +7599,7 @@
       </ns0:oMath>
       <w:r>
         <w:rPr/>
-        <w:t xml:space="preserve"> up; row blocks are not built from the features, although row position is correlated with some of them. In both versions the grouped design runs separately on the flows of each source file, so that both halves hold the same mix of Non-VPN and VPN rows, and in the calibrated designs the number of groups is scaled to the share of the file's flows that a pseudo-context holds, so that groups stay about capture-sized. An earlier version without the per-file split was discarded because its two halves could hold very different shares of Non-VPN and VPN rows.</w:t>
+        <w:t xml:space="preserve"> up. Row blocks are not built from the features, but row position is correlated with some of them, and the blocks of a pseudo-context need not coincide with the moved groups; both would raise the group-level row-block null slightly, so an excess measured against it is conservative. In both versions the grouped design runs separately on the flows of each source file, so that both halves hold the same mix of Non-VPN and VPN rows, and in the calibrated designs the number of groups is scaled to the share of the file's flows that a pseudo-context holds, so that groups stay about capture-sized. With these constraints the halves hold 2,409–3,589 training flows in the group-level version and 2,981–3,475 in the flow-level version, against 3,457–3,476 in the real grouped designs. An earlier version without the per-file split was discarded because its two halves could hold very different shares of Non-VPN and VPN rows.</w:t>
       </w:r>
     </w:p>
     <w:p>
@@ -13079,7 +13079,7 @@
       </w:pPr>
       <w:r>
         <w:rPr/>
-        <w:t xml:space="preserve">The grouped null sharpens the row-order end of this range: at the two row-block settings tested, the grouping produces almost no gap by itself, and the real gaps stay positive on average when both contexts are explained on the same records, whereas for clusters the null itself is uncertain. Explaining both contexts on the same records leaves the XGBoost gap almost unchanged and lowers the Random Forest gap by about 21–28% under random halves and 22–35% under row blocks. None of this tests the excess at the level of captures: no grouped design keeps the test records apart from the training sessions, and both proxies only approximate capture boundaries. Part of the random-split gap therefore reflects variation between groups of related flows, and part of it survives the two row-block settings tested, on each context's own records and on common ones, although under the first-versus-second-half split the XGBoost gap is small and the RBO and Top-5 gaps are negative in some repeats. In every design the outer 80/20 partition is random, and because the two contexts are different sets of captures, the remaining differences cannot be attributed to tunnelling.</w:t>
+        <w:t xml:space="preserve">The grouped null sharpens the row-order end of this range: at the two row-block settings tested, the grouping produces almost no gap by itself, and the real gaps stay positive on average when both contexts are explained on the same records, whereas for clusters the null itself is uncertain. Explaining both contexts on the same records lowers the XGBoost gap by at most about 15% and the Random Forest gap by about 21–28% under random halves and 22–35% under row blocks. None of this tests the excess at the level of captures: no grouped design keeps the test records apart from the training sessions, and both proxies only approximate capture boundaries. Part of the random-split gap therefore reflects variation between groups of related flows, and part of it survives the two row-block settings tested, on each context's own records and on common ones, although under the first-versus-second-half split the XGBoost gap is small and the RBO and Top-5 gaps are negative in some repeats. In every design the outer 80/20 partition is random, and because the two contexts are different sets of captures, the remaining differences cannot be attributed to tunnelling.</w:t>
       </w:r>
     </w:p>
     <w:p>
@@ -38201,7 +38201,7 @@
       </w:r>
       <w:r>
         <w:rPr/>
-        <w:t xml:space="preserve">The answer to the question posed in the title depends on what cross-context agreement is compared with. Against models trained on random halves of one context, VPN and Non-VPN rankings disagree more, in every repeat, and the permutation null shows that neither the half-split procedure nor the class-mix difference produces such a gap. Keeping related flows together reduces the gap, but by how much depends on the proxy for related flows. Feature clusters eliminate most of it; at the settings that the capture counts point to the mean gap is near zero, but the half-models are weak, the gap varies widely, and for Random Forest the mean averages a gap of +0.23 on the Non-VPN side and -0.19 on the VPN side, and clusters also separate regions of feature space that a capture split would not. Blocks of consecutive rows in the original files are not built from the features, although row position is correlated with some of them, and they leave the half-models far more accurate than coarse clusters do. At the capture-calibrated setting they reduce the gap to 0.07 for XGBoost and 0.15 for Random Forest, and even the first-versus-second-half split leaves 0.03 and 0.09 on average. The Spearman gap stays at or above zero in every repeat, but the repeats reuse nearly the same halves, and the RBO and Top-5 gaps turn negative in some of them. The two proxies disagree, and neither is a capture split: clusters may overcorrect, and blocks may undercorrect or, at their strictest, also separate regions of feature space. Together they suggest that part of the random-split gap reflects variation between groups of related flows, from about 20% to nearly all of it depending on the proxy and model. Two further checks narrow this. Explaining both contexts on the same records leaves the XGBoost gap almost unchanged and lowers the Random Forest gap by about 21–28% under random halves and 22–35% under row blocks, so the choice of explained records is not the main source of the disagreement. A grouped permutation null, run for two row-block and three cluster settings, shows that row-block grouping produces almost no gap by itself, so the positive row-block gaps are excess over the null; for clusters, the two versions of the null fall on either side of the observed gap, and the cluster results leave the question open. Some excess therefore remains under the grouping least tied to the features, but its size depends on how closely row blocks follow captures, and without capture identifiers or an independent second capture it cannot be pinned down. Because the contexts are different sets of captures, it cannot be attributed to tunnelling. A random within-context split, which is the usual way such references are built, would have exaggerated it.</w:t>
+        <w:t xml:space="preserve">The answer to the question posed in the title depends on what cross-context agreement is compared with. Against models trained on random halves of one context, VPN and Non-VPN rankings disagree more, in every repeat, and the permutation null shows that neither the half-split procedure nor the class-mix difference produces such a gap. Keeping related flows together reduces the gap, but by how much depends on the proxy for related flows. Feature clusters eliminate most of it; at the settings that the capture counts point to the mean gap is near zero, but the half-models are weak, the gap varies widely, and for Random Forest the mean averages a gap of +0.23 on the Non-VPN side and -0.19 on the VPN side, and clusters also separate regions of feature space that a capture split would not. Blocks of consecutive rows in the original files are not built from the features, although row position is correlated with some of them, and they leave the half-models far more accurate than coarse clusters do. At the capture-calibrated setting they reduce the gap to 0.07 for XGBoost and 0.15 for Random Forest, and even the first-versus-second-half split leaves 0.03 and 0.09 on average. The Spearman gap stays at or above zero in every repeat, but the repeats reuse nearly the same halves, and the RBO and Top-5 gaps turn negative in some of them. The two proxies disagree, and neither is a capture split: clusters may overcorrect, and blocks may undercorrect or, at their strictest, also separate regions of feature space. Together they suggest that part of the random-split gap reflects variation between groups of related flows, from about 20% to nearly all of it depending on the proxy and model. Two further checks narrow this. Explaining both contexts on the same records lowers the XGBoost gap by at most about 15% and the Random Forest gap by about 21–28% under random halves and 22–35% under row blocks, so the choice of explained records is not the main source of the disagreement. A grouped permutation null, run for two row-block and three cluster settings, shows that row-block grouping produces almost no gap by itself, so the positive row-block gaps are excess over the null; for clusters, the two versions of the null fall on either side of the observed gap, and the cluster results leave the question open. Some excess therefore remains under the grouping least tied to the features, but its size depends on how closely row blocks follow captures, and without capture identifiers or an independent second capture it cannot be pinned down. Because the contexts are different sets of captures, it cannot be attributed to tunnelling. A random within-context split, which is the usual way such references are built, would have exaggerated it.</w:t>
       </w:r>
     </w:p>
     <w:p>
@@ -38589,7 +38589,7 @@
       </w:pPr>
       <w:r>
         <w:rPr/>
-        <w:t xml:space="preserve">On this benchmark, then, part of the random-split gap between SHAP rankings reflects variation between groups of related flows within a context, and part of it survives the row-order groupings tested, on each context's own records and on common ones. The two contexts are different sets of captures, so none of the remaining difference can be attributed to tunnelling, and the proxies used here cannot measure a true between-session effect. Captures that keep session identifiers, or an independent second capture of both contexts, would settle the question, and newer traffic and class-specific explanations would show whether the pattern holds beyond this benchmark.</w:t>
+        <w:t xml:space="preserve">On this benchmark, then, part of the random-split gap between SHAP rankings reflects variation between groups of related flows within a context, and part of it survives the two row-order settings tested against the null and on common records. The two contexts are different sets of captures, so none of the remaining difference can be attributed to tunnelling, and the proxies used here cannot measure a true between-session effect. Captures that keep session identifiers, or an independent second capture of both contexts, would settle the question, and newer traffic and class-specific explanations would show whether the pattern holds beyond this benchmark.</w:t>
       </w:r>
     </w:p>
     <w:p>

</xml_diff>